<commit_message>
Repair Excel dashboard and synchronize P1 evidence
</commit_message>
<xml_diff>
--- a/Major-Project/Final_Project_Report.docx
+++ b/Major-Project/Final_Project_Report.docx
@@ -33,22 +33,13 @@
         <w:spacing w:before="400"/>
       </w:pPr>
       <w:r>
-        <w:rPr>
-          <w:b/>
-        </w:rPr>
         <w:t>iNeuBytes Virtual Internship Program (VIIP)</w:t>
         <w:br/>
-      </w:r>
-      <w:r>
         <w:t>Course ID: DAINB10926</w:t>
         <w:br/>
-      </w:r>
-      <w:r>
         <w:t>Project type: Task 1 + Task 2 + Task 3 + Major Project</w:t>
         <w:br/>
-      </w:r>
-      <w:r>
-        <w:t>Prepared: 22 October 2026</w:t>
+        <w:t>Prepared: 22 October 2026 | Updated: 23 October 2026</w:t>
       </w:r>
     </w:p>
     <w:tbl>
@@ -323,18 +314,8 @@
             <w:vAlign w:val="center"/>
           </w:tcPr>
           <w:p>
-            <w:pPr>
-              <w:spacing w:after="80" w:before="80"/>
-            </w:pPr>
-            <w:r/>
-            <w:r>
-              <w:rPr>
-                <w:rFonts w:ascii="Aptos" w:hAnsi="Aptos"/>
-                <w:b w:val="0"/>
-                <w:color w:val="7F4F00"/>
-                <w:sz w:val="18"/>
-              </w:rPr>
-              <w:t>COMPLETION NOTE: This report contains calculated results from the supplied CSVs. Before submission, add your real MySQL, Excel, Power BI and Tableau evidence, replace all placeholders, and remove/update any pending-status statements that no longer apply. No .pbix, .twbx, GitHub URL, Google Docs URL or portal submission is claimed as completed.</w:t>
+            <w:r>
+              <w:t>COMPLETION UPDATE — 23 October 2026: This report contains calculated results from the supplied CSVs. The corrected self-contained SQL, genuine PBIX, Tableau Public evidence, student-supplied application screenshots and public review links are present. The Excel Dashboard_Data source ranges and chart definitions were repaired programmatically; desktop recalculation, selector testing and replacement screenshots remain. Power BI and Tableau require the documented application corrections and final captures. Native Excel PivotTables and a local .twbx remain conditional on the official instructions. Portal submission is not claimed.</w:t>
             </w:r>
           </w:p>
         </w:tc>
@@ -2300,6 +2281,20 @@
             <w:vAlign w:val="center"/>
           </w:tcPr>
           <w:p>
+            <w:r>
+              <w:t>Long CSV, Date-table design and DAX measures; genuine PBIX included; final Desktop corrections and testing pending</w:t>
+            </w:r>
+          </w:p>
+        </w:tc>
+      </w:tr>
+      <w:tr>
+        <w:tc>
+          <w:tcPr>
+            <w:tcW w:type="dxa" w:w="1728"/>
+            <w:vAlign w:val="center"/>
+            <w:shd w:fill="F3F7F9"/>
+          </w:tcPr>
+          <w:p>
             <w:r/>
             <w:r>
               <w:rPr>
@@ -2308,47 +2303,19 @@
                 <w:color w:val="17324D"/>
                 <w:sz w:val="17"/>
               </w:rPr>
-              <w:t>Long CSV, Date-table design and DAX measures; .pbix to be built in Power BI Desktop</w:t>
-            </w:r>
-          </w:p>
-        </w:tc>
-      </w:tr>
-      <w:tr>
-        <w:tc>
-          <w:tcPr>
-            <w:tcW w:type="dxa" w:w="1728"/>
+              <w:t>Tableau</w:t>
+            </w:r>
+          </w:p>
+        </w:tc>
+        <w:tc>
+          <w:tcPr>
+            <w:tcW w:type="dxa" w:w="8352"/>
             <w:vAlign w:val="center"/>
             <w:shd w:fill="F3F7F9"/>
           </w:tcPr>
           <w:p>
-            <w:r/>
-            <w:r>
-              <w:rPr>
-                <w:rFonts w:ascii="Aptos" w:hAnsi="Aptos"/>
-                <w:b w:val="0"/>
-                <w:color w:val="17324D"/>
-                <w:sz w:val="17"/>
-              </w:rPr>
-              <w:t>Tableau</w:t>
-            </w:r>
-          </w:p>
-        </w:tc>
-        <w:tc>
-          <w:tcPr>
-            <w:tcW w:type="dxa" w:w="8352"/>
-            <w:vAlign w:val="center"/>
-            <w:shd w:fill="F3F7F9"/>
-          </w:tcPr>
-          <w:p>
-            <w:r/>
-            <w:r>
-              <w:rPr>
-                <w:rFonts w:ascii="Aptos" w:hAnsi="Aptos"/>
-                <w:b w:val="0"/>
-                <w:color w:val="17324D"/>
-                <w:sz w:val="17"/>
-              </w:rPr>
-              <w:t>Long CSV, calculated fields and dashboard design; .twbx to be built in Tableau</w:t>
+            <w:r>
+              <w:t>Long CSV, calculated fields and Tableau Public dashboard; continuous-month/filter/layout review pending; local .twbx only if required</w:t>
             </w:r>
           </w:p>
         </w:tc>
@@ -3690,7 +3657,7 @@
     </w:p>
     <w:p>
       <w:r>
-        <w:t>The file `Task-1-SQL/pharma_sales_analysis.sql` contains a complete MySQL 8.0 workflow: database creation, text staging, quality checks, type conversion, a clean daily table, long and monthly views, and ten business-query sections. The student must change the LOAD DATA path and run it in MySQL to produce application evidence.</w:t>
+        <w:t>The file `Task-1/pharma_sales_analysis.sql` contains a self-contained MySQL 8.0 workflow: text staging, all 2,106 embedded source rows, quality checks, type conversion, a clean daily table, category lookup, long and monthly views, and 20 numbered analytical queries. It uses an allowed currently selected schema and requires no external CSV path, LOAD DATA, CREATE DATABASE or USE. Student-supplied MySQL 8.0 execution and result screenshots are included; independent assistant execution is not claimed.</w:t>
       </w:r>
     </w:p>
     <w:p>
@@ -3982,7 +3949,7 @@
     </w:p>
     <w:p>
       <w:r>
-        <w:t>Additional result CSVs cover category contribution, monthly trend, complete-month ranking, annual coverage, weekday patterns and the ten highest days. These tables were calculated from the supplied CSVs using the same business logic; they are not claimed as screenshots of a MySQL run.</w:t>
+        <w:t>Additional result CSVs cover category contribution, monthly trend, complete-month ranking, annual coverage, weekday patterns and the ten highest days. These tables were calculated from the supplied CSVs using the same business logic and remain reconciliation tables, not screenshots. Genuine MySQL execution and result screenshots are stored separately under `Major-Project/Screenshots/Task-1-SQL/`.</w:t>
       </w:r>
     </w:p>
     <w:p>
@@ -3995,7 +3962,7 @@
     </w:p>
     <w:p>
       <w:r>
-        <w:t>The workbook `Pharma_Sales_Analysis.xlsx` includes raw, clean and long data; data-quality evidence; formula examples; monthly/category/weekday summaries; and a dashboard with Year and Category selectors. Formula cells include cached initial values and should be recalculated in desktop Excel.</w:t>
+        <w:t>The workbook `Pharma_Sales_Analysis.xlsx` includes raw, clean and long data; data-quality evidence; formula examples; monthly/category/weekday summaries; and a dashboard with Year and Category selectors. On 23 October 2026, the `Dashboard_Data` monthly and category source ranges and chart definitions were repaired programmatically. The underlying clean/long totals were unchanged. Desktop Excel recalculation, reopening and selector testing are still required.</w:t>
       </w:r>
     </w:p>
     <w:tbl>
@@ -4311,7 +4278,7 @@
     </w:p>
     <w:p>
       <w:r>
-        <w:t>The dashboard’s drop-down cells recalculate KPI cards and charts. With both selectors set to All, expected checks are Total Quantity 127,595.50, Average Daily Quantity 60.59 and Days in Selection 2,106.</w:t>
+        <w:t>The dashboard’s drop-down cells are intended to recalculate KPI cards and charts. With both selectors set to All, expected checks are Total Quantity 127,595.50, Average Daily Quantity 60.59, Days in Selection 2,106 and N02BE share 49.38%. The existing dashboard captures predate the source-range repair and must be replaced with genuine post-repair Excel screenshots after validation.</w:t>
       </w:r>
     </w:p>
     <w:tbl>
@@ -4331,18 +4298,8 @@
             <w:vAlign w:val="center"/>
           </w:tcPr>
           <w:p>
-            <w:pPr>
-              <w:spacing w:after="80" w:before="80"/>
-            </w:pPr>
-            <w:r/>
-            <w:r>
-              <w:rPr>
-                <w:rFonts w:ascii="Aptos" w:hAnsi="Aptos"/>
-                <w:b w:val="0"/>
-                <w:color w:val="7F4F00"/>
-                <w:sz w:val="18"/>
-              </w:rPr>
-              <w:t>Excel evidence still to finish: open and validate the workbook, insert native PivotTable objects if your mentor requires them, and capture actual Excel application screenshots. The supplied pivot-style summary sheets and generated chart previews are not mislabelled as native PivotTables or screenshots.</w:t>
+            <w:r>
+              <w:t>Excel evidence update: the workbook’s Dashboard_Data monthly/category source ranges and chart definitions were repaired programmatically, and the underlying totals were preserved. Open the workbook in desktop Excel, fully recalculate, save, close, reopen and test both selectors. Replace the pre-repair dashboard screenshots with genuine post-repair captures. Insert native PivotTable objects only if required by the official instructions.</w:t>
             </w:r>
           </w:p>
         </w:tc>
@@ -4363,7 +4320,7 @@
     </w:p>
     <w:p>
       <w:r>
-        <w:t>Both BI tools use `pharma_sales_long.csv`, which has 16,848 rows (2,106 dates × 8 categories). The long shape allows one ATC_Category filter to control category and time visuals. Power BI uses a separate Date table and DAX measures; Tableau uses aggregate calculated fields and worksheet filters.</w:t>
+        <w:t>Both BI tools use `pharma_sales_long.csv`, which has 16,848 rows (2,106 dates × 8 categories). The long shape allows one ATC_Category filter to control category and time visuals. A genuine Power BI PBIX and a Tableau Public dashboard are included. PBIX structure was checked, but Desktop reopening and interactivity were not independently verified. Final Power BI continuous-month/filter/sorting/label corrections and Tableau continuous-month/filter/layout corrections remain documented manual work.</w:t>
       </w:r>
     </w:p>
     <w:tbl>
@@ -4691,18 +4648,8 @@
             <w:vAlign w:val="center"/>
           </w:tcPr>
           <w:p>
-            <w:pPr>
-              <w:spacing w:after="80" w:before="80"/>
-            </w:pPr>
-            <w:r/>
-            <w:r>
-              <w:rPr>
-                <w:rFonts w:ascii="Aptos" w:hAnsi="Aptos"/>
-                <w:b w:val="0"/>
-                <w:color w:val="7F4F00"/>
-                <w:sz w:val="18"/>
-              </w:rPr>
-              <w:t>The actual Pharma_Sales_Dashboard.pbix and Pharma_Sales_Dashboard.twbx files remain to be created in their respective applications. Detailed build guides, DAX and Tableau calculated fields are supplied.</w:t>
+            <w:r>
+              <w:t>A genuine `Pharma_Sales_Dashboard.pbix` is included and passed structural package checks. It was not reopened in this environment; final Power BI Desktop corrections, filter testing and final-layout screenshots remain. A Tableau Public dashboard and static/application previews are included. Continuous Month, complete-month filtering, Year/ATC filters, weekday ordering and layout require final review. A local `.twbx` is not claimed and should be created only if required by the mentor.</w:t>
             </w:r>
           </w:p>
         </w:tc>
@@ -8411,6 +8358,31 @@
             <w:shd w:fill="F3F7F9"/>
           </w:tcPr>
           <w:p>
+            <w:r>
+              <w:t>Supplied: self-contained pharma_sales_analysis.sql with exact embedded source rows</w:t>
+            </w:r>
+          </w:p>
+        </w:tc>
+        <w:tc>
+          <w:tcPr>
+            <w:tcW w:type="dxa" w:w="3389"/>
+            <w:vAlign w:val="center"/>
+            <w:shd w:fill="F3F7F9"/>
+          </w:tcPr>
+          <w:p>
+            <w:r>
+              <w:t>MySQL 8.0 execution/result screenshots supplied; independent assistant rerun not claimed</w:t>
+            </w:r>
+          </w:p>
+        </w:tc>
+      </w:tr>
+      <w:tr>
+        <w:tc>
+          <w:tcPr>
+            <w:tcW w:type="dxa" w:w="3389"/>
+            <w:vAlign w:val="center"/>
+          </w:tcPr>
+          <w:p>
             <w:r/>
             <w:r>
               <w:rPr>
@@ -8419,7 +8391,7 @@
                 <w:color w:val="17324D"/>
                 <w:sz w:val="15"/>
               </w:rPr>
-              <w:t>Supplied: pharma_sales_analysis.sql</w:t>
+              <w:t>Query results</w:t>
             </w:r>
           </w:p>
         </w:tc>
@@ -8427,7 +8399,6 @@
           <w:tcPr>
             <w:tcW w:type="dxa" w:w="3389"/>
             <w:vAlign w:val="center"/>
-            <w:shd w:fill="F3F7F9"/>
           </w:tcPr>
           <w:p>
             <w:r/>
@@ -8438,12 +8409,10 @@
                 <w:color w:val="17324D"/>
                 <w:sz w:val="15"/>
               </w:rPr>
-              <w:t>Run in MySQL and capture real results</w:t>
-            </w:r>
-          </w:p>
-        </w:tc>
-      </w:tr>
-      <w:tr>
+              <w:t>Calculated CSV tables supplied</w:t>
+            </w:r>
+          </w:p>
+        </w:tc>
         <w:tc>
           <w:tcPr>
             <w:tcW w:type="dxa" w:w="3389"/>
@@ -8458,14 +8427,17 @@
                 <w:color w:val="17324D"/>
                 <w:sz w:val="15"/>
               </w:rPr>
-              <w:t>Query results</w:t>
-            </w:r>
-          </w:p>
-        </w:tc>
+              <w:t>Export/compare actual MySQL results if required</w:t>
+            </w:r>
+          </w:p>
+        </w:tc>
+      </w:tr>
+      <w:tr>
         <w:tc>
           <w:tcPr>
             <w:tcW w:type="dxa" w:w="3389"/>
             <w:vAlign w:val="center"/>
+            <w:shd w:fill="F3F7F9"/>
           </w:tcPr>
           <w:p>
             <w:r/>
@@ -8476,10 +8448,36 @@
                 <w:color w:val="17324D"/>
                 <w:sz w:val="15"/>
               </w:rPr>
-              <w:t>Calculated CSV tables supplied</w:t>
-            </w:r>
-          </w:p>
-        </w:tc>
+              <w:t>Excel workbook</w:t>
+            </w:r>
+          </w:p>
+        </w:tc>
+        <w:tc>
+          <w:tcPr>
+            <w:tcW w:type="dxa" w:w="3389"/>
+            <w:vAlign w:val="center"/>
+            <w:shd w:fill="F3F7F9"/>
+          </w:tcPr>
+          <w:p>
+            <w:r>
+              <w:t>Pharma_Sales_Analysis.xlsx supplied; Dashboard_Data and chart definitions repaired</w:t>
+            </w:r>
+          </w:p>
+        </w:tc>
+        <w:tc>
+          <w:tcPr>
+            <w:tcW w:type="dxa" w:w="3389"/>
+            <w:vAlign w:val="center"/>
+            <w:shd w:fill="F3F7F9"/>
+          </w:tcPr>
+          <w:p>
+            <w:r>
+              <w:t>Recalculate/reopen in desktop Excel, test selectors and replace pre-repair dashboard screenshots; add native PivotTables only if required</w:t>
+            </w:r>
+          </w:p>
+        </w:tc>
+      </w:tr>
+      <w:tr>
         <w:tc>
           <w:tcPr>
             <w:tcW w:type="dxa" w:w="3389"/>
@@ -8494,7 +8492,29 @@
                 <w:color w:val="17324D"/>
                 <w:sz w:val="15"/>
               </w:rPr>
-              <w:t>Export/compare actual MySQL results if required</w:t>
+              <w:t>Power BI file</w:t>
+            </w:r>
+          </w:p>
+        </w:tc>
+        <w:tc>
+          <w:tcPr>
+            <w:tcW w:type="dxa" w:w="3389"/>
+            <w:vAlign w:val="center"/>
+          </w:tcPr>
+          <w:p>
+            <w:r>
+              <w:t>Genuine PBIX supplied; data model, four pages and package integrity verified</w:t>
+            </w:r>
+          </w:p>
+        </w:tc>
+        <w:tc>
+          <w:tcPr>
+            <w:tcW w:type="dxa" w:w="3389"/>
+            <w:vAlign w:val="center"/>
+          </w:tcPr>
+          <w:p>
+            <w:r>
+              <w:t>Apply documented Desktop corrections, reopen/filter-test all pages and capture final evidence</w:t>
             </w:r>
           </w:p>
         </w:tc>
@@ -8515,7 +8535,7 @@
                 <w:color w:val="17324D"/>
                 <w:sz w:val="15"/>
               </w:rPr>
-              <w:t>Excel workbook</w:t>
+              <w:t>Tableau workbook</w:t>
             </w:r>
           </w:p>
         </w:tc>
@@ -8524,6 +8544,31 @@
             <w:tcW w:type="dxa" w:w="3389"/>
             <w:vAlign w:val="center"/>
             <w:shd w:fill="F3F7F9"/>
+          </w:tcPr>
+          <w:p>
+            <w:r>
+              <w:t>Tableau Public dashboard and genuine preview/application captures supplied; no local .twbx claimed</w:t>
+            </w:r>
+          </w:p>
+        </w:tc>
+        <w:tc>
+          <w:tcPr>
+            <w:tcW w:type="dxa" w:w="3389"/>
+            <w:vAlign w:val="center"/>
+            <w:shd w:fill="F3F7F9"/>
+          </w:tcPr>
+          <w:p>
+            <w:r>
+              <w:t>Correct continuous Month, filters, weekday order and layout; republish/test; create .twbx only if required</w:t>
+            </w:r>
+          </w:p>
+        </w:tc>
+      </w:tr>
+      <w:tr>
+        <w:tc>
+          <w:tcPr>
+            <w:tcW w:type="dxa" w:w="3389"/>
+            <w:vAlign w:val="center"/>
           </w:tcPr>
           <w:p>
             <w:r/>
@@ -8534,10 +8579,34 @@
                 <w:color w:val="17324D"/>
                 <w:sz w:val="15"/>
               </w:rPr>
-              <w:t>Pharma_Sales_Analysis.xlsx supplied</w:t>
-            </w:r>
-          </w:p>
-        </w:tc>
+              <w:t>Screenshots</w:t>
+            </w:r>
+          </w:p>
+        </w:tc>
+        <w:tc>
+          <w:tcPr>
+            <w:tcW w:type="dxa" w:w="3389"/>
+            <w:vAlign w:val="center"/>
+          </w:tcPr>
+          <w:p>
+            <w:r>
+              <w:t>Generated charts plus genuine MySQL, Excel, Power BI and Tableau captures supplied and labelled</w:t>
+            </w:r>
+          </w:p>
+        </w:tc>
+        <w:tc>
+          <w:tcPr>
+            <w:tcW w:type="dxa" w:w="3389"/>
+            <w:vAlign w:val="center"/>
+          </w:tcPr>
+          <w:p>
+            <w:r>
+              <w:t>Replace pre-repair Excel/BI captures and add final filtered evidence after actual application validation</w:t>
+            </w:r>
+          </w:p>
+        </w:tc>
+      </w:tr>
+      <w:tr>
         <w:tc>
           <w:tcPr>
             <w:tcW w:type="dxa" w:w="3389"/>
@@ -8553,16 +8622,15 @@
                 <w:color w:val="17324D"/>
                 <w:sz w:val="15"/>
               </w:rPr>
-              <w:t>Validate, add native PivotTables if required, capture dashboard</w:t>
-            </w:r>
-          </w:p>
-        </w:tc>
-      </w:tr>
-      <w:tr>
+              <w:t>README</w:t>
+            </w:r>
+          </w:p>
+        </w:tc>
         <w:tc>
           <w:tcPr>
             <w:tcW w:type="dxa" w:w="3389"/>
             <w:vAlign w:val="center"/>
+            <w:shd w:fill="F3F7F9"/>
           </w:tcPr>
           <w:p>
             <w:r/>
@@ -8573,10 +8641,24 @@
                 <w:color w:val="17324D"/>
                 <w:sz w:val="15"/>
               </w:rPr>
-              <w:t>Power BI file</w:t>
-            </w:r>
-          </w:p>
-        </w:tc>
+              <w:t>Supplied with actual results and honest status</w:t>
+            </w:r>
+          </w:p>
+        </w:tc>
+        <w:tc>
+          <w:tcPr>
+            <w:tcW w:type="dxa" w:w="3389"/>
+            <w:vAlign w:val="center"/>
+            <w:shd w:fill="F3F7F9"/>
+          </w:tcPr>
+          <w:p>
+            <w:r>
+              <w:t>Keep the current status, exact paths and remaining manual steps updated</w:t>
+            </w:r>
+          </w:p>
+        </w:tc>
+      </w:tr>
+      <w:tr>
         <w:tc>
           <w:tcPr>
             <w:tcW w:type="dxa" w:w="3389"/>
@@ -8591,7 +8673,7 @@
                 <w:color w:val="17324D"/>
                 <w:sz w:val="15"/>
               </w:rPr>
-              <w:t>Not generated; guide and DAX supplied</w:t>
+              <w:t>Final report</w:t>
             </w:r>
           </w:p>
         </w:tc>
@@ -8609,7 +8691,18 @@
                 <w:color w:val="17324D"/>
                 <w:sz w:val="15"/>
               </w:rPr>
-              <w:t>Build and save Pharma_Sales_Dashboard.pbix</w:t>
+              <w:t>This DOCX supplied</w:t>
+            </w:r>
+          </w:p>
+        </w:tc>
+        <w:tc>
+          <w:tcPr>
+            <w:tcW w:type="dxa" w:w="3389"/>
+            <w:vAlign w:val="center"/>
+          </w:tcPr>
+          <w:p>
+            <w:r>
+              <w:t>Current report synchronised on 23 October 2026; update again after final application evidence</w:t>
             </w:r>
           </w:p>
         </w:tc>
@@ -8630,7 +8723,7 @@
                 <w:color w:val="17324D"/>
                 <w:sz w:val="15"/>
               </w:rPr>
-              <w:t>Tableau workbook</w:t>
+              <w:t>GitHub/Google Docs/portal</w:t>
             </w:r>
           </w:p>
         </w:tc>
@@ -8641,15 +8734,8 @@
             <w:shd w:fill="F3F7F9"/>
           </w:tcPr>
           <w:p>
-            <w:r/>
-            <w:r>
-              <w:rPr>
-                <w:rFonts w:ascii="Aptos" w:hAnsi="Aptos"/>
-                <w:b w:val="0"/>
-                <w:color w:val="17324D"/>
-                <w:sz w:val="15"/>
-              </w:rPr>
-              <w:t>Not generated; guide and calculations supplied</w:t>
+            <w:r>
+              <w:t>Public GitHub repository and Google Doc created; portal submission not claimed</w:t>
             </w:r>
           </w:p>
         </w:tc>
@@ -8660,245 +8746,8 @@
             <w:shd w:fill="F3F7F9"/>
           </w:tcPr>
           <w:p>
-            <w:r/>
-            <w:r>
-              <w:rPr>
-                <w:rFonts w:ascii="Aptos" w:hAnsi="Aptos"/>
-                <w:b w:val="0"/>
-                <w:color w:val="17324D"/>
-                <w:sz w:val="15"/>
-              </w:rPr>
-              <w:t>Build and save Pharma_Sales_Dashboard.twbx</w:t>
-            </w:r>
-          </w:p>
-        </w:tc>
-      </w:tr>
-      <w:tr>
-        <w:tc>
-          <w:tcPr>
-            <w:tcW w:type="dxa" w:w="3389"/>
-            <w:vAlign w:val="center"/>
-          </w:tcPr>
-          <w:p>
-            <w:r/>
-            <w:r>
-              <w:rPr>
-                <w:rFonts w:ascii="Aptos" w:hAnsi="Aptos"/>
-                <w:b w:val="0"/>
-                <w:color w:val="17324D"/>
-                <w:sz w:val="15"/>
-              </w:rPr>
-              <w:t>Screenshots</w:t>
-            </w:r>
-          </w:p>
-        </w:tc>
-        <w:tc>
-          <w:tcPr>
-            <w:tcW w:type="dxa" w:w="3389"/>
-            <w:vAlign w:val="center"/>
-          </w:tcPr>
-          <w:p>
-            <w:r/>
-            <w:r>
-              <w:rPr>
-                <w:rFonts w:ascii="Aptos" w:hAnsi="Aptos"/>
-                <w:b w:val="0"/>
-                <w:color w:val="17324D"/>
-                <w:sz w:val="15"/>
-              </w:rPr>
-              <w:t>Generated charts supplied and labelled</w:t>
-            </w:r>
-          </w:p>
-        </w:tc>
-        <w:tc>
-          <w:tcPr>
-            <w:tcW w:type="dxa" w:w="3389"/>
-            <w:vAlign w:val="center"/>
-          </w:tcPr>
-          <w:p>
-            <w:r/>
-            <w:r>
-              <w:rPr>
-                <w:rFonts w:ascii="Aptos" w:hAnsi="Aptos"/>
-                <w:b w:val="0"/>
-                <w:color w:val="17324D"/>
-                <w:sz w:val="15"/>
-              </w:rPr>
-              <w:t>Add real MySQL/Excel/Power BI/Tableau screenshots</w:t>
-            </w:r>
-          </w:p>
-        </w:tc>
-      </w:tr>
-      <w:tr>
-        <w:tc>
-          <w:tcPr>
-            <w:tcW w:type="dxa" w:w="3389"/>
-            <w:vAlign w:val="center"/>
-            <w:shd w:fill="F3F7F9"/>
-          </w:tcPr>
-          <w:p>
-            <w:r/>
-            <w:r>
-              <w:rPr>
-                <w:rFonts w:ascii="Aptos" w:hAnsi="Aptos"/>
-                <w:b w:val="0"/>
-                <w:color w:val="17324D"/>
-                <w:sz w:val="15"/>
-              </w:rPr>
-              <w:t>README</w:t>
-            </w:r>
-          </w:p>
-        </w:tc>
-        <w:tc>
-          <w:tcPr>
-            <w:tcW w:type="dxa" w:w="3389"/>
-            <w:vAlign w:val="center"/>
-            <w:shd w:fill="F3F7F9"/>
-          </w:tcPr>
-          <w:p>
-            <w:r/>
-            <w:r>
-              <w:rPr>
-                <w:rFonts w:ascii="Aptos" w:hAnsi="Aptos"/>
-                <w:b w:val="0"/>
-                <w:color w:val="17324D"/>
-                <w:sz w:val="15"/>
-              </w:rPr>
-              <w:t>Supplied with actual results and honest status</w:t>
-            </w:r>
-          </w:p>
-        </w:tc>
-        <w:tc>
-          <w:tcPr>
-            <w:tcW w:type="dxa" w:w="3389"/>
-            <w:vAlign w:val="center"/>
-            <w:shd w:fill="F3F7F9"/>
-          </w:tcPr>
-          <w:p>
-            <w:r/>
-            <w:r>
-              <w:rPr>
-                <w:rFonts w:ascii="Aptos" w:hAnsi="Aptos"/>
-                <w:b w:val="0"/>
-                <w:color w:val="17324D"/>
-                <w:sz w:val="15"/>
-              </w:rPr>
-              <w:t>Replace personal/link placeholders</w:t>
-            </w:r>
-          </w:p>
-        </w:tc>
-      </w:tr>
-      <w:tr>
-        <w:tc>
-          <w:tcPr>
-            <w:tcW w:type="dxa" w:w="3389"/>
-            <w:vAlign w:val="center"/>
-          </w:tcPr>
-          <w:p>
-            <w:r/>
-            <w:r>
-              <w:rPr>
-                <w:rFonts w:ascii="Aptos" w:hAnsi="Aptos"/>
-                <w:b w:val="0"/>
-                <w:color w:val="17324D"/>
-                <w:sz w:val="15"/>
-              </w:rPr>
-              <w:t>Final report</w:t>
-            </w:r>
-          </w:p>
-        </w:tc>
-        <w:tc>
-          <w:tcPr>
-            <w:tcW w:type="dxa" w:w="3389"/>
-            <w:vAlign w:val="center"/>
-          </w:tcPr>
-          <w:p>
-            <w:r/>
-            <w:r>
-              <w:rPr>
-                <w:rFonts w:ascii="Aptos" w:hAnsi="Aptos"/>
-                <w:b w:val="0"/>
-                <w:color w:val="17324D"/>
-                <w:sz w:val="15"/>
-              </w:rPr>
-              <w:t>This DOCX supplied</w:t>
-            </w:r>
-          </w:p>
-        </w:tc>
-        <w:tc>
-          <w:tcPr>
-            <w:tcW w:type="dxa" w:w="3389"/>
-            <w:vAlign w:val="center"/>
-          </w:tcPr>
-          <w:p>
-            <w:r/>
-            <w:r>
-              <w:rPr>
-                <w:rFonts w:ascii="Aptos" w:hAnsi="Aptos"/>
-                <w:b w:val="0"/>
-                <w:color w:val="17324D"/>
-                <w:sz w:val="15"/>
-              </w:rPr>
-              <w:t>Personalise, add evidence and verify before Google Docs upload</w:t>
-            </w:r>
-          </w:p>
-        </w:tc>
-      </w:tr>
-      <w:tr>
-        <w:tc>
-          <w:tcPr>
-            <w:tcW w:type="dxa" w:w="3389"/>
-            <w:vAlign w:val="center"/>
-            <w:shd w:fill="F3F7F9"/>
-          </w:tcPr>
-          <w:p>
-            <w:r/>
-            <w:r>
-              <w:rPr>
-                <w:rFonts w:ascii="Aptos" w:hAnsi="Aptos"/>
-                <w:b w:val="0"/>
-                <w:color w:val="17324D"/>
-                <w:sz w:val="15"/>
-              </w:rPr>
-              <w:t>GitHub/Google Docs/portal</w:t>
-            </w:r>
-          </w:p>
-        </w:tc>
-        <w:tc>
-          <w:tcPr>
-            <w:tcW w:type="dxa" w:w="3389"/>
-            <w:vAlign w:val="center"/>
-            <w:shd w:fill="F3F7F9"/>
-          </w:tcPr>
-          <w:p>
-            <w:r/>
-            <w:r>
-              <w:rPr>
-                <w:rFonts w:ascii="Aptos" w:hAnsi="Aptos"/>
-                <w:b w:val="0"/>
-                <w:color w:val="17324D"/>
-                <w:sz w:val="15"/>
-              </w:rPr>
-              <w:t>Not claimed complete</w:t>
-            </w:r>
-          </w:p>
-        </w:tc>
-        <w:tc>
-          <w:tcPr>
-            <w:tcW w:type="dxa" w:w="3389"/>
-            <w:vAlign w:val="center"/>
-            <w:shd w:fill="F3F7F9"/>
-          </w:tcPr>
-          <w:p>
-            <w:r/>
-            <w:r>
-              <w:rPr>
-                <w:rFonts w:ascii="Aptos" w:hAnsi="Aptos"/>
-                <w:b w:val="0"/>
-                <w:color w:val="17324D"/>
-                <w:sz w:val="15"/>
-              </w:rPr>
-              <w:t>Create, test and submit real links per official instructions</w:t>
+            <w:r>
+              <w:t>Set the Doc to anyone-with-link Reader, retest review links and submit only after remaining manual checks</w:t>
             </w:r>
           </w:p>
         </w:tc>
@@ -8950,7 +8799,7 @@
         <w:pStyle w:val="Heading2"/>
       </w:pPr>
       <w:r>
-        <w:t>14.2 Screenshot insertion checklist</w:t>
+        <w:t>14.2 Application evidence status</w:t>
       </w:r>
     </w:p>
     <w:tbl>
@@ -8976,15 +8825,8 @@
             <w:shd w:fill="17324D"/>
           </w:tcPr>
           <w:p>
-            <w:r/>
-            <w:r>
-              <w:rPr>
-                <w:rFonts w:ascii="Aptos" w:hAnsi="Aptos"/>
-                <w:b/>
-                <w:color w:val="FFFFFF"/>
-                <w:sz w:val="17"/>
-              </w:rPr>
-              <w:t>Evidence to insert</w:t>
+            <w:r>
+              <w:t>Evidence item</w:t>
             </w:r>
           </w:p>
         </w:tc>
@@ -8995,15 +8837,8 @@
             <w:shd w:fill="17324D"/>
           </w:tcPr>
           <w:p>
-            <w:r/>
-            <w:r>
-              <w:rPr>
-                <w:rFonts w:ascii="Aptos" w:hAnsi="Aptos"/>
-                <w:b/>
-                <w:color w:val="FFFFFF"/>
-                <w:sz w:val="17"/>
-              </w:rPr>
-              <w:t>Suggested caption</w:t>
+            <w:r>
+              <w:t>Current status / next action</w:t>
             </w:r>
           </w:p>
         </w:tc>
@@ -9033,6 +8868,20 @@
             <w:vAlign w:val="center"/>
           </w:tcPr>
           <w:p>
+            <w:r>
+              <w:t>Five genuine MySQL 8.0 execution/result captures supplied; no replacement indicated by the audited evidence</w:t>
+            </w:r>
+          </w:p>
+        </w:tc>
+      </w:tr>
+      <w:tr>
+        <w:tc>
+          <w:tcPr>
+            <w:tcW w:type="dxa" w:w="3888"/>
+            <w:vAlign w:val="center"/>
+            <w:shd w:fill="F3F7F9"/>
+          </w:tcPr>
+          <w:p>
             <w:r/>
             <w:r>
               <w:rPr>
@@ -9041,7 +8890,19 @@
                 <w:color w:val="17324D"/>
                 <w:sz w:val="17"/>
               </w:rPr>
-              <w:t>SQL query and result grid for quantity analysis</w:t>
+              <w:t>Excel dashboard</w:t>
+            </w:r>
+          </w:p>
+        </w:tc>
+        <w:tc>
+          <w:tcPr>
+            <w:tcW w:type="dxa" w:w="6192"/>
+            <w:vAlign w:val="center"/>
+            <w:shd w:fill="F3F7F9"/>
+          </w:tcPr>
+          <w:p>
+            <w:r>
+              <w:t>Pre-repair dashboard captures retained; replace after desktop recalculation and selector testing</w:t>
             </w:r>
           </w:p>
         </w:tc>
@@ -9051,7 +8912,6 @@
           <w:tcPr>
             <w:tcW w:type="dxa" w:w="3888"/>
             <w:vAlign w:val="center"/>
-            <w:shd w:fill="F3F7F9"/>
           </w:tcPr>
           <w:p>
             <w:r/>
@@ -9062,13 +8922,26 @@
                 <w:color w:val="17324D"/>
                 <w:sz w:val="17"/>
               </w:rPr>
-              <w:t>Excel dashboard</w:t>
+              <w:t>Power BI dashboard</w:t>
             </w:r>
           </w:p>
         </w:tc>
         <w:tc>
           <w:tcPr>
             <w:tcW w:type="dxa" w:w="6192"/>
+            <w:vAlign w:val="center"/>
+          </w:tcPr>
+          <w:p>
+            <w:r>
+              <w:t>Summary and earlier development captures supplied; final four-page and filtered captures pending</w:t>
+            </w:r>
+          </w:p>
+        </w:tc>
+      </w:tr>
+      <w:tr>
+        <w:tc>
+          <w:tcPr>
+            <w:tcW w:type="dxa" w:w="3888"/>
             <w:vAlign w:val="center"/>
             <w:shd w:fill="F3F7F9"/>
           </w:tcPr>
@@ -9081,27 +8954,7 @@
                 <w:color w:val="17324D"/>
                 <w:sz w:val="17"/>
               </w:rPr>
-              <w:t>Excel dashboard with KPI cards, charts and selectors</w:t>
-            </w:r>
-          </w:p>
-        </w:tc>
-      </w:tr>
-      <w:tr>
-        <w:tc>
-          <w:tcPr>
-            <w:tcW w:type="dxa" w:w="3888"/>
-            <w:vAlign w:val="center"/>
-          </w:tcPr>
-          <w:p>
-            <w:r/>
-            <w:r>
-              <w:rPr>
-                <w:rFonts w:ascii="Aptos" w:hAnsi="Aptos"/>
-                <w:b w:val="0"/>
-                <w:color w:val="17324D"/>
-                <w:sz w:val="17"/>
-              </w:rPr>
-              <w:t>Power BI dashboard</w:t>
+              <w:t>Tableau dashboard</w:t>
             </w:r>
           </w:p>
         </w:tc>
@@ -9109,57 +8962,11 @@
           <w:tcPr>
             <w:tcW w:type="dxa" w:w="6192"/>
             <w:vAlign w:val="center"/>
-          </w:tcPr>
-          <w:p>
-            <w:r/>
-            <w:r>
-              <w:rPr>
-                <w:rFonts w:ascii="Aptos" w:hAnsi="Aptos"/>
-                <w:b w:val="0"/>
-                <w:color w:val="17324D"/>
-                <w:sz w:val="17"/>
-              </w:rPr>
-              <w:t>Power BI sales overview with filters applied</w:t>
-            </w:r>
-          </w:p>
-        </w:tc>
-      </w:tr>
-      <w:tr>
-        <w:tc>
-          <w:tcPr>
-            <w:tcW w:type="dxa" w:w="3888"/>
-            <w:vAlign w:val="center"/>
             <w:shd w:fill="F3F7F9"/>
           </w:tcPr>
           <w:p>
-            <w:r/>
-            <w:r>
-              <w:rPr>
-                <w:rFonts w:ascii="Aptos" w:hAnsi="Aptos"/>
-                <w:b w:val="0"/>
-                <w:color w:val="17324D"/>
-                <w:sz w:val="17"/>
-              </w:rPr>
-              <w:t>Tableau dashboard</w:t>
-            </w:r>
-          </w:p>
-        </w:tc>
-        <w:tc>
-          <w:tcPr>
-            <w:tcW w:type="dxa" w:w="6192"/>
-            <w:vAlign w:val="center"/>
-            <w:shd w:fill="F3F7F9"/>
-          </w:tcPr>
-          <w:p>
-            <w:r/>
-            <w:r>
-              <w:rPr>
-                <w:rFonts w:ascii="Aptos" w:hAnsi="Aptos"/>
-                <w:b w:val="0"/>
-                <w:color w:val="17324D"/>
-                <w:sz w:val="17"/>
-              </w:rPr>
-              <w:t>Tableau sales overview with filters applied</w:t>
+            <w:r>
+              <w:t>Public/Desktop captures supplied; replace after continuous-month, filter, sorting and layout corrections</w:t>
             </w:r>
           </w:p>
         </w:tc>
@@ -9172,7 +8979,7 @@
     </w:p>
     <w:p>
       <w:r>
-        <w:t>After inserting each real screenshot, add one sentence explaining what the viewer should learn. Do not replace application evidence with the generated preview.</w:t>
+        <w:t>Use only genuine application screenshots and add one sentence explaining what each image demonstrates. Existing SQL evidence is retained. Pre-repair Excel and earlier Power BI development captures must not be represented as final post-correction evidence. Replace or add final captures only after the actual applications have been corrected and tested.</w:t>
       </w:r>
     </w:p>
     <w:p>
@@ -9185,29 +8992,18 @@
     </w:p>
     <w:p>
       <w:r>
-        <w:rPr>
-          <w:rFonts w:ascii="Consolas" w:hAnsi="Consolas"/>
-          <w:color w:val="7F3F00"/>
-          <w:sz w:val="18"/>
-        </w:rPr>
-        <w:t>Task-1-SQL/</w:t>
+        <w:t>Task-1/</w:t>
         <w:br/>
-        <w:t>Task-2-Excel/</w:t>
-        <w:br/>
-        <w:t>Task-3-PowerBI-Tableau/</w:t>
+        <w:t>Task-2/</w:t>
         <w:br/>
         <w:t>Major-Project/</w:t>
-        <w:br/>
-        <w:t>Documentation/</w:t>
-        <w:br/>
-        <w:t>Screenshots/</w:t>
         <w:br/>
         <w:t>README.md</w:t>
       </w:r>
     </w:p>
     <w:p>
       <w:r>
-        <w:t>Repository name: internsAparnareddy_INBT026297_iNeuBytes. Submit only real, tested GitHub and Google Docs URLs after completing the remaining application evidence.</w:t>
+        <w:t>Repository name: internsAparnareddy_INBT026297_iNeuBytes. The public GitHub repository and Google Doc exist. Test their review links again after the remaining application corrections and submit only through the official P1 portal.</w:t>
       </w:r>
     </w:p>
     <w:sectPr>

</xml_diff>